<commit_message>
docs: Refine installation guide title and intro
</commit_message>
<xml_diff>
--- a/docs/INSTALLATION_GUIDE.docx
+++ b/docs/INSTALLATION_GUIDE.docx
@@ -2,13 +2,13 @@
 <file path=word/document.xml><?xml version="1.0" encoding="utf-8"?>
 <w:document xmlns:w="http://schemas.openxmlformats.org/wordprocessingml/2006/main" xmlns:m="http://schemas.openxmlformats.org/officeDocument/2006/math" xmlns:r="http://schemas.openxmlformats.org/officeDocument/2006/relationships" xmlns:o="urn:schemas-microsoft-com:office:office" xmlns:v="urn:schemas-microsoft-com:vml" xmlns:w10="urn:schemas-microsoft-com:office:word" xmlns:a="http://schemas.openxmlformats.org/drawingml/2006/main" xmlns:pic="http://schemas.openxmlformats.org/drawingml/2006/picture" xmlns:wp="http://schemas.openxmlformats.org/drawingml/2006/wordprocessingDrawing">
   <w:body>
-    <w:bookmarkStart w:id="22" w:name="X1b64c74d51354953f67db1f35f0d3217506ff84"/>
+    <w:bookmarkStart w:id="22" w:name="Xc5dea78e75798998e75fe2ce43b7a11e9fff1f7"/>
     <w:p>
       <w:pPr>
         <w:pStyle w:val="Heading1"/>
       </w:pPr>
       <w:r>
-        <w:t xml:space="preserve">Astrosoft - Tester Download &amp; Installation Guide</w:t>
+        <w:t xml:space="preserve">Astrosoft 2.0 - Download &amp; Installation Guide</w:t>
       </w:r>
     </w:p>
     <w:p>
@@ -16,23 +16,7 @@
         <w:pStyle w:val="FirstParagraph"/>
       </w:pPr>
       <w:r>
-        <w:t xml:space="preserve">Welcome to the</w:t>
-      </w:r>
-      <w:r>
-        <w:t xml:space="preserve"> </w:t>
-      </w:r>
-      <w:r>
-        <w:rPr>
-          <w:b/>
-          <w:bCs/>
-        </w:rPr>
-        <w:t xml:space="preserve">Astrosoft</w:t>
-      </w:r>
-      <w:r>
-        <w:t xml:space="preserve"> </w:t>
-      </w:r>
-      <w:r>
-        <w:t xml:space="preserve">tester program! This guide walks you through installing the required Java 21 runtime, downloading Astrosoft, and launching the software on</w:t>
+        <w:t xml:space="preserve">This guide walks you through installing the required Java 21 runtime, downloading Astrosoft, and launching the software on</w:t>
       </w:r>
       <w:r>
         <w:t xml:space="preserve"> </w:t>

</xml_diff>

<commit_message>
feat(launcher): add Mac app installer, isolated JDK 21 launcher, and Documents default dir
</commit_message>
<xml_diff>
--- a/docs/INSTALLATION_GUIDE.docx
+++ b/docs/INSTALLATION_GUIDE.docx
@@ -2,7 +2,7 @@
 <file path=word/document.xml><?xml version="1.0" encoding="utf-8"?>
 <w:document xmlns:w="http://schemas.openxmlformats.org/wordprocessingml/2006/main" xmlns:m="http://schemas.openxmlformats.org/officeDocument/2006/math" xmlns:r="http://schemas.openxmlformats.org/officeDocument/2006/relationships" xmlns:o="urn:schemas-microsoft-com:office:office" xmlns:v="urn:schemas-microsoft-com:vml" xmlns:w10="urn:schemas-microsoft-com:office:word" xmlns:a="http://schemas.openxmlformats.org/drawingml/2006/main" xmlns:pic="http://schemas.openxmlformats.org/drawingml/2006/picture" xmlns:wp="http://schemas.openxmlformats.org/drawingml/2006/wordprocessingDrawing">
   <w:body>
-    <w:bookmarkStart w:id="22" w:name="Xc5dea78e75798998e75fe2ce43b7a11e9fff1f7"/>
+    <w:bookmarkStart w:id="24" w:name="Xc5dea78e75798998e75fe2ce43b7a11e9fff1f7"/>
     <w:p>
       <w:pPr>
         <w:pStyle w:val="Heading1"/>
@@ -822,7 +822,7 @@
     </w:p>
     <w:bookmarkEnd w:id="14"/>
     <w:bookmarkEnd w:id="15"/>
-    <w:bookmarkStart w:id="18" w:name="step-3-launch-astrosoft"/>
+    <w:bookmarkStart w:id="20" w:name="step-3-launch-astrosoft"/>
     <w:p>
       <w:pPr>
         <w:pStyle w:val="Heading2"/>
@@ -899,7 +899,7 @@
           <w:b/>
           <w:bCs/>
         </w:rPr>
-        <w:t xml:space="preserve">RunAstroSoft.bat</w:t>
+        <w:t xml:space="preserve">RunAstroSoft20.bat</w:t>
       </w:r>
       <w:r>
         <w:t xml:space="preserve">.</w:t>
@@ -933,7 +933,7 @@
           <w:b/>
           <w:bCs/>
         </w:rPr>
-        <w:t xml:space="preserve">RunAstroSoft.bat</w:t>
+        <w:t xml:space="preserve">RunAstroSoft20.bat</w:t>
       </w:r>
       <w:r>
         <w:t xml:space="preserve"> </w:t>
@@ -964,7 +964,7 @@
           <w:i/>
           <w:iCs/>
         </w:rPr>
-        <w:t xml:space="preserve">RunAstroSoft.bat</w:t>
+        <w:t xml:space="preserve">RunAstroSoft20.bat</w:t>
       </w:r>
       <w:r>
         <w:rPr>
@@ -1035,7 +1035,7 @@
       </w:r>
     </w:p>
     <w:bookmarkEnd w:id="16"/>
-    <w:bookmarkStart w:id="17" w:name="on-macos"/>
+    <w:bookmarkStart w:id="19" w:name="on-macos"/>
     <w:p>
       <w:pPr>
         <w:pStyle w:val="Heading3"/>
@@ -1044,31 +1044,25 @@
         <w:t xml:space="preserve">On macOS</w:t>
       </w:r>
     </w:p>
-    <w:p>
-      <w:pPr>
+    <w:bookmarkStart w:id="17" w:name="Xeab3aac4fd8901cfa1dcf57d035220001ba8c81"/>
+    <w:p>
+      <w:pPr>
+        <w:pStyle w:val="Heading4"/>
+      </w:pPr>
+      <w:r>
+        <w:t xml:space="preserve">Method A: Install to Applications &amp; Dock / Launch Bar (Recommended)</w:t>
+      </w:r>
+    </w:p>
+    <w:p>
+      <w:pPr>
+        <w:pStyle w:val="Compact"/>
         <w:numPr>
           <w:ilvl w:val="0"/>
           <w:numId w:val="1009"/>
         </w:numPr>
       </w:pPr>
       <w:r>
-        <w:t xml:space="preserve">Open</w:t>
-      </w:r>
-      <w:r>
-        <w:t xml:space="preserve"> </w:t>
-      </w:r>
-      <w:r>
-        <w:rPr>
-          <w:b/>
-          <w:bCs/>
-        </w:rPr>
-        <w:t xml:space="preserve">Terminal</w:t>
-      </w:r>
-      <w:r>
-        <w:t xml:space="preserve"> </w:t>
-      </w:r>
-      <w:r>
-        <w:t xml:space="preserve">(press</w:t>
+        <w:t xml:space="preserve">Open the extracted</w:t>
       </w:r>
       <w:r>
         <w:t xml:space="preserve"> </w:t>
@@ -1076,30 +1070,535 @@
       <w:r>
         <w:rPr>
           <w:rStyle w:val="VerbatimChar"/>
-        </w:rPr>
-        <w:t xml:space="preserve">Cmd + Space</w:t>
-      </w:r>
-      <w:r>
-        <w:t xml:space="preserve">, type</w:t>
-      </w:r>
-      <w:r>
-        <w:t xml:space="preserve"> </w:t>
-      </w:r>
-      <w:r>
-        <w:rPr>
-          <w:rStyle w:val="VerbatimChar"/>
-        </w:rPr>
-        <w:t xml:space="preserve">Terminal</w:t>
-      </w:r>
-      <w:r>
-        <w:t xml:space="preserve">, and hit Enter).</w:t>
-      </w:r>
-    </w:p>
-    <w:p>
-      <w:pPr>
+          <w:b/>
+          <w:bCs/>
+        </w:rPr>
+        <w:t xml:space="preserve">Astrosoft-master</w:t>
+      </w:r>
+      <w:r>
+        <w:t xml:space="preserve"> </w:t>
+      </w:r>
+      <w:r>
+        <w:t xml:space="preserve">folder in</w:t>
+      </w:r>
+      <w:r>
+        <w:t xml:space="preserve"> </w:t>
+      </w:r>
+      <w:r>
+        <w:rPr>
+          <w:b/>
+          <w:bCs/>
+        </w:rPr>
+        <w:t xml:space="preserve">Finder</w:t>
+      </w:r>
+      <w:r>
+        <w:t xml:space="preserve">.</w:t>
+      </w:r>
+    </w:p>
+    <w:p>
+      <w:pPr>
+        <w:pStyle w:val="Compact"/>
         <w:numPr>
           <w:ilvl w:val="0"/>
           <w:numId w:val="1009"/>
+        </w:numPr>
+      </w:pPr>
+      <w:r>
+        <w:t xml:space="preserve">Locate</w:t>
+      </w:r>
+      <w:r>
+        <w:t xml:space="preserve"> </w:t>
+      </w:r>
+      <w:r>
+        <w:rPr>
+          <w:rStyle w:val="VerbatimChar"/>
+          <w:b/>
+          <w:bCs/>
+        </w:rPr>
+        <w:t xml:space="preserve">InstallMacApp.command</w:t>
+      </w:r>
+      <w:r>
+        <w:t xml:space="preserve"> </w:t>
+      </w:r>
+      <w:r>
+        <w:t xml:space="preserve">and</w:t>
+      </w:r>
+      <w:r>
+        <w:t xml:space="preserve"> </w:t>
+      </w:r>
+      <w:r>
+        <w:rPr>
+          <w:b/>
+          <w:bCs/>
+        </w:rPr>
+        <w:t xml:space="preserve">double-click</w:t>
+      </w:r>
+      <w:r>
+        <w:t xml:space="preserve"> </w:t>
+      </w:r>
+      <w:r>
+        <w:t xml:space="preserve">it (or right-click →</w:t>
+      </w:r>
+      <w:r>
+        <w:t xml:space="preserve"> </w:t>
+      </w:r>
+      <w:r>
+        <w:rPr>
+          <w:b/>
+          <w:bCs/>
+        </w:rPr>
+        <w:t xml:space="preserve">Open</w:t>
+      </w:r>
+      <w:r>
+        <w:t xml:space="preserve">).</w:t>
+      </w:r>
+    </w:p>
+    <w:p>
+      <w:pPr>
+        <w:pStyle w:val="Compact"/>
+        <w:numPr>
+          <w:ilvl w:val="1"/>
+          <w:numId w:val="1010"/>
+        </w:numPr>
+      </w:pPr>
+      <w:r>
+        <w:rPr>
+          <w:i/>
+          <w:iCs/>
+        </w:rPr>
+        <w:t xml:space="preserve">Note:</w:t>
+      </w:r>
+      <w:r>
+        <w:t xml:space="preserve"> </w:t>
+      </w:r>
+      <w:r>
+        <w:t xml:space="preserve">If macOS shows an</w:t>
+      </w:r>
+      <w:r>
+        <w:t xml:space="preserve"> </w:t>
+      </w:r>
+      <w:r>
+        <w:rPr>
+          <w:i/>
+          <w:iCs/>
+        </w:rPr>
+        <w:t xml:space="preserve">“unidentified developer”</w:t>
+      </w:r>
+      <w:r>
+        <w:t xml:space="preserve"> </w:t>
+      </w:r>
+      <w:r>
+        <w:t xml:space="preserve">security prompt on first run, open</w:t>
+      </w:r>
+      <w:r>
+        <w:t xml:space="preserve"> </w:t>
+      </w:r>
+      <w:r>
+        <w:rPr>
+          <w:b/>
+          <w:bCs/>
+        </w:rPr>
+        <w:t xml:space="preserve">System Settings → Privacy &amp; Security</w:t>
+      </w:r>
+      <w:r>
+        <w:t xml:space="preserve">, scroll down to</w:t>
+      </w:r>
+      <w:r>
+        <w:t xml:space="preserve"> </w:t>
+      </w:r>
+      <w:r>
+        <w:rPr>
+          <w:b/>
+          <w:bCs/>
+        </w:rPr>
+        <w:t xml:space="preserve">Security</w:t>
+      </w:r>
+      <w:r>
+        <w:t xml:space="preserve">, and click</w:t>
+      </w:r>
+      <w:r>
+        <w:t xml:space="preserve"> </w:t>
+      </w:r>
+      <w:r>
+        <w:rPr>
+          <w:b/>
+          <w:bCs/>
+        </w:rPr>
+        <w:t xml:space="preserve">Open Anyway</w:t>
+      </w:r>
+      <w:r>
+        <w:t xml:space="preserve"> </w:t>
+      </w:r>
+      <w:r>
+        <w:t xml:space="preserve">next to</w:t>
+      </w:r>
+      <w:r>
+        <w:t xml:space="preserve"> </w:t>
+      </w:r>
+      <w:r>
+        <w:rPr>
+          <w:rStyle w:val="VerbatimChar"/>
+        </w:rPr>
+        <w:t xml:space="preserve">InstallMacApp.command</w:t>
+      </w:r>
+      <w:r>
+        <w:t xml:space="preserve">.</w:t>
+      </w:r>
+    </w:p>
+    <w:p>
+      <w:pPr>
+        <w:pStyle w:val="Compact"/>
+        <w:numPr>
+          <w:ilvl w:val="0"/>
+          <w:numId w:val="1009"/>
+        </w:numPr>
+      </w:pPr>
+      <w:r>
+        <w:t xml:space="preserve">The installer will automatically build a self-contained</w:t>
+      </w:r>
+      <w:r>
+        <w:t xml:space="preserve"> </w:t>
+      </w:r>
+      <w:r>
+        <w:rPr>
+          <w:rStyle w:val="VerbatimChar"/>
+          <w:b/>
+          <w:bCs/>
+        </w:rPr>
+        <w:t xml:space="preserve">Astrosoft20</w:t>
+      </w:r>
+      <w:r>
+        <w:t xml:space="preserve"> </w:t>
+      </w:r>
+      <w:r>
+        <w:t xml:space="preserve">application inside your macOS</w:t>
+      </w:r>
+      <w:r>
+        <w:t xml:space="preserve"> </w:t>
+      </w:r>
+      <w:r>
+        <w:rPr>
+          <w:b/>
+          <w:bCs/>
+        </w:rPr>
+        <w:t xml:space="preserve">Applications</w:t>
+      </w:r>
+      <w:r>
+        <w:t xml:space="preserve"> </w:t>
+      </w:r>
+      <w:r>
+        <w:t xml:space="preserve">folder (</w:t>
+      </w:r>
+      <w:r>
+        <w:rPr>
+          <w:rStyle w:val="VerbatimChar"/>
+        </w:rPr>
+        <w:t xml:space="preserve">/Applications/Astrosoft20.app</w:t>
+      </w:r>
+      <w:r>
+        <w:t xml:space="preserve">) and reveal it in Finder.</w:t>
+      </w:r>
+    </w:p>
+    <w:p>
+      <w:pPr>
+        <w:pStyle w:val="Compact"/>
+        <w:numPr>
+          <w:ilvl w:val="0"/>
+          <w:numId w:val="1009"/>
+        </w:numPr>
+      </w:pPr>
+      <w:r>
+        <w:t xml:space="preserve">Double-click</w:t>
+      </w:r>
+      <w:r>
+        <w:t xml:space="preserve"> </w:t>
+      </w:r>
+      <w:r>
+        <w:rPr>
+          <w:rStyle w:val="VerbatimChar"/>
+          <w:b/>
+          <w:bCs/>
+        </w:rPr>
+        <w:t xml:space="preserve">Astrosoft20</w:t>
+      </w:r>
+      <w:r>
+        <w:t xml:space="preserve"> </w:t>
+      </w:r>
+      <w:r>
+        <w:t xml:space="preserve">in</w:t>
+      </w:r>
+      <w:r>
+        <w:t xml:space="preserve"> </w:t>
+      </w:r>
+      <w:r>
+        <w:rPr>
+          <w:b/>
+          <w:bCs/>
+        </w:rPr>
+        <w:t xml:space="preserve">Applications</w:t>
+      </w:r>
+      <w:r>
+        <w:t xml:space="preserve"> </w:t>
+      </w:r>
+      <w:r>
+        <w:t xml:space="preserve">to launch it.</w:t>
+      </w:r>
+    </w:p>
+    <w:p>
+      <w:pPr>
+        <w:pStyle w:val="Compact"/>
+        <w:numPr>
+          <w:ilvl w:val="0"/>
+          <w:numId w:val="1009"/>
+        </w:numPr>
+      </w:pPr>
+      <w:r>
+        <w:rPr>
+          <w:b/>
+          <w:bCs/>
+        </w:rPr>
+        <w:t xml:space="preserve">Add to Launch Bar (Dock):</w:t>
+      </w:r>
+      <w:r>
+        <w:t xml:space="preserve"> </w:t>
+      </w:r>
+      <w:r>
+        <w:t xml:space="preserve">Drag</w:t>
+      </w:r>
+      <w:r>
+        <w:t xml:space="preserve"> </w:t>
+      </w:r>
+      <w:r>
+        <w:rPr>
+          <w:rStyle w:val="VerbatimChar"/>
+          <w:b/>
+          <w:bCs/>
+        </w:rPr>
+        <w:t xml:space="preserve">Astrosoft20</w:t>
+      </w:r>
+      <w:r>
+        <w:t xml:space="preserve"> </w:t>
+      </w:r>
+      <w:r>
+        <w:t xml:space="preserve">from</w:t>
+      </w:r>
+      <w:r>
+        <w:t xml:space="preserve"> </w:t>
+      </w:r>
+      <w:r>
+        <w:rPr>
+          <w:b/>
+          <w:bCs/>
+        </w:rPr>
+        <w:t xml:space="preserve">Applications</w:t>
+      </w:r>
+      <w:r>
+        <w:t xml:space="preserve"> </w:t>
+      </w:r>
+      <w:r>
+        <w:t xml:space="preserve">onto your</w:t>
+      </w:r>
+      <w:r>
+        <w:t xml:space="preserve"> </w:t>
+      </w:r>
+      <w:r>
+        <w:rPr>
+          <w:b/>
+          <w:bCs/>
+        </w:rPr>
+        <w:t xml:space="preserve">Dock</w:t>
+      </w:r>
+      <w:r>
+        <w:t xml:space="preserve"> </w:t>
+      </w:r>
+      <w:r>
+        <w:t xml:space="preserve">(or right-click the</w:t>
+      </w:r>
+      <w:r>
+        <w:t xml:space="preserve"> </w:t>
+      </w:r>
+      <w:r>
+        <w:rPr>
+          <w:b/>
+          <w:bCs/>
+        </w:rPr>
+        <w:t xml:space="preserve">Astrosoft20</w:t>
+      </w:r>
+      <w:r>
+        <w:t xml:space="preserve"> </w:t>
+      </w:r>
+      <w:r>
+        <w:t xml:space="preserve">icon in the Dock while it is running and select</w:t>
+      </w:r>
+      <w:r>
+        <w:t xml:space="preserve"> </w:t>
+      </w:r>
+      <w:r>
+        <w:rPr>
+          <w:b/>
+          <w:bCs/>
+        </w:rPr>
+        <w:t xml:space="preserve">Options → Keep in Dock</w:t>
+      </w:r>
+      <w:r>
+        <w:t xml:space="preserve">). You can now start Astrosoft20 anytime with a single click!</w:t>
+      </w:r>
+    </w:p>
+    <w:p>
+      <w:pPr>
+        <w:pStyle w:val="BlockText"/>
+      </w:pPr>
+      <w:r>
+        <w:t xml:space="preserve">[!TIP]</w:t>
+      </w:r>
+      <w:r>
+        <w:t xml:space="preserve"> </w:t>
+      </w:r>
+      <w:r>
+        <w:rPr>
+          <w:b/>
+          <w:bCs/>
+        </w:rPr>
+        <w:t xml:space="preserve">Subsequent Updates:</w:t>
+      </w:r>
+      <w:r>
+        <w:t xml:space="preserve"> </w:t>
+      </w:r>
+      <w:r>
+        <w:t xml:space="preserve">When you download a newer version of Astrosoft in the future, simply run</w:t>
+      </w:r>
+      <w:r>
+        <w:t xml:space="preserve"> </w:t>
+      </w:r>
+      <w:r>
+        <w:rPr>
+          <w:rStyle w:val="VerbatimChar"/>
+        </w:rPr>
+        <w:t xml:space="preserve">InstallMacApp.command</w:t>
+      </w:r>
+      <w:r>
+        <w:t xml:space="preserve"> </w:t>
+      </w:r>
+      <w:r>
+        <w:t xml:space="preserve">again. It cleanly removes the previous build and updates</w:t>
+      </w:r>
+      <w:r>
+        <w:t xml:space="preserve"> </w:t>
+      </w:r>
+      <w:r>
+        <w:rPr>
+          <w:rStyle w:val="VerbatimChar"/>
+        </w:rPr>
+        <w:t xml:space="preserve">/Applications/Astrosoft20.app</w:t>
+      </w:r>
+      <w:r>
+        <w:t xml:space="preserve"> </w:t>
+      </w:r>
+      <w:r>
+        <w:t xml:space="preserve">with the latest binaries. Your user settings (</w:t>
+      </w:r>
+      <w:r>
+        <w:rPr>
+          <w:rStyle w:val="VerbatimChar"/>
+        </w:rPr>
+        <w:t xml:space="preserve">~/.astrosoft_prefs/</w:t>
+      </w:r>
+      <w:r>
+        <w:t xml:space="preserve">) and charts are kept safe.</w:t>
+      </w:r>
+    </w:p>
+    <w:p>
+      <w:pPr>
+        <w:pStyle w:val="BlockText"/>
+      </w:pPr>
+      <w:r>
+        <w:t xml:space="preserve">[!NOTE]</w:t>
+      </w:r>
+      <w:r>
+        <w:t xml:space="preserve"> </w:t>
+      </w:r>
+      <w:r>
+        <w:t xml:space="preserve">Application logs on macOS are standardly saved to</w:t>
+      </w:r>
+      <w:r>
+        <w:t xml:space="preserve"> </w:t>
+      </w:r>
+      <w:r>
+        <w:rPr>
+          <w:rStyle w:val="VerbatimChar"/>
+        </w:rPr>
+        <w:t xml:space="preserve">~/Library/Logs/Astrosoft20/astrosoft.log</w:t>
+      </w:r>
+      <w:r>
+        <w:t xml:space="preserve">.</w:t>
+      </w:r>
+    </w:p>
+    <w:bookmarkEnd w:id="17"/>
+    <w:bookmarkStart w:id="18" w:name="Xab69d73b08c3011a24e0af4a1b30bbd40a31294"/>
+    <w:p>
+      <w:pPr>
+        <w:pStyle w:val="Heading4"/>
+      </w:pPr>
+      <w:r>
+        <w:t xml:space="preserve">Method B: Launch from Terminal (Advanced Users)</w:t>
+      </w:r>
+    </w:p>
+    <w:p>
+      <w:pPr>
+        <w:numPr>
+          <w:ilvl w:val="0"/>
+          <w:numId w:val="1011"/>
+        </w:numPr>
+      </w:pPr>
+      <w:r>
+        <w:t xml:space="preserve">Open</w:t>
+      </w:r>
+      <w:r>
+        <w:t xml:space="preserve"> </w:t>
+      </w:r>
+      <w:r>
+        <w:rPr>
+          <w:b/>
+          <w:bCs/>
+        </w:rPr>
+        <w:t xml:space="preserve">Terminal</w:t>
+      </w:r>
+      <w:r>
+        <w:t xml:space="preserve"> </w:t>
+      </w:r>
+      <w:r>
+        <w:t xml:space="preserve">(press</w:t>
+      </w:r>
+      <w:r>
+        <w:t xml:space="preserve"> </w:t>
+      </w:r>
+      <w:r>
+        <w:rPr>
+          <w:rStyle w:val="VerbatimChar"/>
+        </w:rPr>
+        <w:t xml:space="preserve">Cmd + Space</w:t>
+      </w:r>
+      <w:r>
+        <w:t xml:space="preserve">, type</w:t>
+      </w:r>
+      <w:r>
+        <w:t xml:space="preserve"> </w:t>
+      </w:r>
+      <w:r>
+        <w:rPr>
+          <w:rStyle w:val="VerbatimChar"/>
+        </w:rPr>
+        <w:t xml:space="preserve">Terminal</w:t>
+      </w:r>
+      <w:r>
+        <w:t xml:space="preserve">, and hit Enter).</w:t>
+      </w:r>
+    </w:p>
+    <w:p>
+      <w:pPr>
+        <w:numPr>
+          <w:ilvl w:val="0"/>
+          <w:numId w:val="1011"/>
         </w:numPr>
       </w:pPr>
       <w:r>
@@ -1175,7 +1674,7 @@
       <w:pPr>
         <w:numPr>
           <w:ilvl w:val="0"/>
-          <w:numId w:val="1009"/>
+          <w:numId w:val="1011"/>
         </w:numPr>
       </w:pPr>
       <w:r>
@@ -1200,18 +1699,18 @@
         <w:rPr>
           <w:rStyle w:val="NormalTok"/>
         </w:rPr>
-        <w:t xml:space="preserve"> +x RunAstroSoft.sh bin/RunAstroSoft.sh</w:t>
+        <w:t xml:space="preserve"> +x RunAstroSoft20.sh bin/RunAstroSoft20.sh InstallMacApp.command</w:t>
       </w:r>
     </w:p>
     <w:p>
       <w:pPr>
         <w:numPr>
           <w:ilvl w:val="0"/>
-          <w:numId w:val="1009"/>
-        </w:numPr>
-      </w:pPr>
-      <w:r>
-        <w:t xml:space="preserve">Launch Astrosoft:</w:t>
+          <w:numId w:val="1011"/>
+        </w:numPr>
+      </w:pPr>
+      <w:r>
+        <w:t xml:space="preserve">Launch Astrosoft directly:</w:t>
       </w:r>
     </w:p>
     <w:p>
@@ -1226,7 +1725,102 @@
         <w:rPr>
           <w:rStyle w:val="ExtensionTok"/>
         </w:rPr>
-        <w:t xml:space="preserve">./RunAstroSoft.sh</w:t>
+        <w:t xml:space="preserve">./RunAstroSoft20.sh</w:t>
+      </w:r>
+    </w:p>
+    <w:p>
+      <w:pPr>
+        <w:numPr>
+          <w:ilvl w:val="0"/>
+          <w:numId w:val="1000"/>
+        </w:numPr>
+      </w:pPr>
+      <w:r>
+        <w:rPr>
+          <w:i/>
+          <w:iCs/>
+        </w:rPr>
+        <w:t xml:space="preserve">(Or run</w:t>
+      </w:r>
+      <w:r>
+        <w:rPr>
+          <w:i/>
+          <w:iCs/>
+        </w:rPr>
+        <w:t xml:space="preserve"> </w:t>
+      </w:r>
+      <w:r>
+        <w:rPr>
+          <w:rStyle w:val="VerbatimChar"/>
+          <w:i/>
+          <w:iCs/>
+        </w:rPr>
+        <w:t xml:space="preserve">./InstallMacApp.command</w:t>
+      </w:r>
+      <w:r>
+        <w:rPr>
+          <w:i/>
+          <w:iCs/>
+        </w:rPr>
+        <w:t xml:space="preserve"> </w:t>
+      </w:r>
+      <w:r>
+        <w:rPr>
+          <w:i/>
+          <w:iCs/>
+        </w:rPr>
+        <w:t xml:space="preserve">once to install</w:t>
+      </w:r>
+      <w:r>
+        <w:rPr>
+          <w:i/>
+          <w:iCs/>
+        </w:rPr>
+        <w:t xml:space="preserve"> </w:t>
+      </w:r>
+      <w:r>
+        <w:rPr>
+          <w:rStyle w:val="VerbatimChar"/>
+          <w:i/>
+          <w:iCs/>
+        </w:rPr>
+        <w:t xml:space="preserve">Astrosoft20.app</w:t>
+      </w:r>
+      <w:r>
+        <w:rPr>
+          <w:i/>
+          <w:iCs/>
+        </w:rPr>
+        <w:t xml:space="preserve"> </w:t>
+      </w:r>
+      <w:r>
+        <w:rPr>
+          <w:i/>
+          <w:iCs/>
+        </w:rPr>
+        <w:t xml:space="preserve">into</w:t>
+      </w:r>
+      <w:r>
+        <w:rPr>
+          <w:i/>
+          <w:iCs/>
+        </w:rPr>
+        <w:t xml:space="preserve"> </w:t>
+      </w:r>
+      <w:r>
+        <w:rPr>
+          <w:rStyle w:val="VerbatimChar"/>
+          <w:i/>
+          <w:iCs/>
+        </w:rPr>
+        <w:t xml:space="preserve">/Applications</w:t>
+      </w:r>
+      <w:r>
+        <w:rPr>
+          <w:i/>
+          <w:iCs/>
+        </w:rPr>
+        <w:t xml:space="preserve">).</w:t>
       </w:r>
     </w:p>
     <w:p>
@@ -1240,7 +1834,7 @@
         <w:t xml:space="preserve"> </w:t>
       </w:r>
       <w:r>
-        <w:t xml:space="preserve">If macOS displays a gatekeeper security prompt regarding unsigned files, open</w:t>
+        <w:t xml:space="preserve">If macOS displays a Gatekeeper security prompt regarding unsigned files, open</w:t>
       </w:r>
       <w:r>
         <w:t xml:space="preserve"> </w:t>
@@ -1282,9 +1876,10 @@
         </w:pict>
       </w:r>
     </w:p>
-    <w:bookmarkEnd w:id="17"/>
     <w:bookmarkEnd w:id="18"/>
-    <w:bookmarkStart w:id="19" w:name="first-time-configuration-quick-check"/>
+    <w:bookmarkEnd w:id="19"/>
+    <w:bookmarkEnd w:id="20"/>
+    <w:bookmarkStart w:id="21" w:name="first-time-configuration-quick-check"/>
     <w:p>
       <w:pPr>
         <w:pStyle w:val="Heading2"/>
@@ -1306,7 +1901,7 @@
         <w:pStyle w:val="Compact"/>
         <w:numPr>
           <w:ilvl w:val="0"/>
-          <w:numId w:val="1010"/>
+          <w:numId w:val="1012"/>
         </w:numPr>
       </w:pPr>
       <w:r>
@@ -1338,7 +1933,7 @@
         <w:pStyle w:val="Compact"/>
         <w:numPr>
           <w:ilvl w:val="0"/>
-          <w:numId w:val="1010"/>
+          <w:numId w:val="1012"/>
         </w:numPr>
       </w:pPr>
       <w:r>
@@ -1347,208 +1942,6 @@
           <w:bCs/>
         </w:rPr>
         <w:t xml:space="preserve">Setting Your Default Location</w:t>
-      </w:r>
-      <w:r>
-        <w:t xml:space="preserve">:</w:t>
-      </w:r>
-    </w:p>
-    <w:p>
-      <w:pPr>
-        <w:pStyle w:val="Compact"/>
-        <w:numPr>
-          <w:ilvl w:val="1"/>
-          <w:numId w:val="1011"/>
-        </w:numPr>
-      </w:pPr>
-      <w:r>
-        <w:t xml:space="preserve">Go to</w:t>
-      </w:r>
-      <w:r>
-        <w:t xml:space="preserve"> </w:t>
-      </w:r>
-      <w:r>
-        <w:rPr>
-          <w:b/>
-          <w:bCs/>
-        </w:rPr>
-        <w:t xml:space="preserve">Options → Preferences</w:t>
-      </w:r>
-      <w:r>
-        <w:t xml:space="preserve"> </w:t>
-      </w:r>
-      <w:r>
-        <w:t xml:space="preserve">(or press</w:t>
-      </w:r>
-      <w:r>
-        <w:t xml:space="preserve"> </w:t>
-      </w:r>
-      <w:r>
-        <w:rPr>
-          <w:rStyle w:val="VerbatimChar"/>
-        </w:rPr>
-        <w:t xml:space="preserve">Ctrl+P</w:t>
-      </w:r>
-      <w:r>
-        <w:t xml:space="preserve"> </w:t>
-      </w:r>
-      <w:r>
-        <w:t xml:space="preserve">/</w:t>
-      </w:r>
-      <w:r>
-        <w:t xml:space="preserve"> </w:t>
-      </w:r>
-      <w:r>
-        <w:rPr>
-          <w:rStyle w:val="VerbatimChar"/>
-        </w:rPr>
-        <w:t xml:space="preserve">Cmd+,</w:t>
-      </w:r>
-      <w:r>
-        <w:t xml:space="preserve">).</w:t>
-      </w:r>
-    </w:p>
-    <w:p>
-      <w:pPr>
-        <w:pStyle w:val="Compact"/>
-        <w:numPr>
-          <w:ilvl w:val="1"/>
-          <w:numId w:val="1011"/>
-        </w:numPr>
-      </w:pPr>
-      <w:r>
-        <w:t xml:space="preserve">Select the</w:t>
-      </w:r>
-      <w:r>
-        <w:t xml:space="preserve"> </w:t>
-      </w:r>
-      <w:r>
-        <w:rPr>
-          <w:b/>
-          <w:bCs/>
-        </w:rPr>
-        <w:t xml:space="preserve">Place</w:t>
-      </w:r>
-      <w:r>
-        <w:t xml:space="preserve"> </w:t>
-      </w:r>
-      <w:r>
-        <w:t xml:space="preserve">tab.</w:t>
-      </w:r>
-    </w:p>
-    <w:p>
-      <w:pPr>
-        <w:pStyle w:val="Compact"/>
-        <w:numPr>
-          <w:ilvl w:val="1"/>
-          <w:numId w:val="1011"/>
-        </w:numPr>
-      </w:pPr>
-      <w:r>
-        <w:t xml:space="preserve">Select your City, State, and Country (built-in coordinates exist for major worldwide and Indian cities, or enter custom Latitude/Longitude and TimeZone).</w:t>
-      </w:r>
-    </w:p>
-    <w:p>
-      <w:pPr>
-        <w:pStyle w:val="Compact"/>
-        <w:numPr>
-          <w:ilvl w:val="1"/>
-          <w:numId w:val="1011"/>
-        </w:numPr>
-      </w:pPr>
-      <w:r>
-        <w:t xml:space="preserve">Click</w:t>
-      </w:r>
-      <w:r>
-        <w:t xml:space="preserve"> </w:t>
-      </w:r>
-      <w:r>
-        <w:rPr>
-          <w:b/>
-          <w:bCs/>
-        </w:rPr>
-        <w:t xml:space="preserve">Save</w:t>
-      </w:r>
-      <w:r>
-        <w:t xml:space="preserve"> </w:t>
-      </w:r>
-      <w:r>
-        <w:t xml:space="preserve">/</w:t>
-      </w:r>
-      <w:r>
-        <w:t xml:space="preserve"> </w:t>
-      </w:r>
-      <w:r>
-        <w:rPr>
-          <w:b/>
-          <w:bCs/>
-        </w:rPr>
-        <w:t xml:space="preserve">OK</w:t>
-      </w:r>
-      <w:r>
-        <w:t xml:space="preserve">.</w:t>
-      </w:r>
-    </w:p>
-    <w:p>
-      <w:pPr>
-        <w:pStyle w:val="Compact"/>
-        <w:numPr>
-          <w:ilvl w:val="0"/>
-          <w:numId w:val="1010"/>
-        </w:numPr>
-      </w:pPr>
-      <w:r>
-        <w:rPr>
-          <w:b/>
-          <w:bCs/>
-        </w:rPr>
-        <w:t xml:space="preserve">Setting Ayanamsa</w:t>
-      </w:r>
-      <w:r>
-        <w:t xml:space="preserve">:</w:t>
-      </w:r>
-    </w:p>
-    <w:p>
-      <w:pPr>
-        <w:pStyle w:val="Compact"/>
-        <w:numPr>
-          <w:ilvl w:val="1"/>
-          <w:numId w:val="1012"/>
-        </w:numPr>
-      </w:pPr>
-      <w:r>
-        <w:t xml:space="preserve">Astrosoft defaults to</w:t>
-      </w:r>
-      <w:r>
-        <w:t xml:space="preserve"> </w:t>
-      </w:r>
-      <w:r>
-        <w:rPr>
-          <w:b/>
-          <w:bCs/>
-        </w:rPr>
-        <w:t xml:space="preserve">Lahiri</w:t>
-      </w:r>
-      <w:r>
-        <w:t xml:space="preserve"> </w:t>
-      </w:r>
-      <w:r>
-        <w:t xml:space="preserve">ayanamsa (Chitrapaksha), with Raman and KP ayanamsas available under Preferences.</w:t>
-      </w:r>
-    </w:p>
-    <w:p>
-      <w:pPr>
-        <w:pStyle w:val="Compact"/>
-        <w:numPr>
-          <w:ilvl w:val="0"/>
-          <w:numId w:val="1010"/>
-        </w:numPr>
-      </w:pPr>
-      <w:r>
-        <w:rPr>
-          <w:b/>
-          <w:bCs/>
-        </w:rPr>
-        <w:t xml:space="preserve">Opening Muhurta</w:t>
       </w:r>
       <w:r>
         <w:t xml:space="preserve">:</w:t>
@@ -1560,6 +1953,208 @@
         <w:numPr>
           <w:ilvl w:val="1"/>
           <w:numId w:val="1013"/>
+        </w:numPr>
+      </w:pPr>
+      <w:r>
+        <w:t xml:space="preserve">Go to</w:t>
+      </w:r>
+      <w:r>
+        <w:t xml:space="preserve"> </w:t>
+      </w:r>
+      <w:r>
+        <w:rPr>
+          <w:b/>
+          <w:bCs/>
+        </w:rPr>
+        <w:t xml:space="preserve">Options → Preferences</w:t>
+      </w:r>
+      <w:r>
+        <w:t xml:space="preserve"> </w:t>
+      </w:r>
+      <w:r>
+        <w:t xml:space="preserve">(or press</w:t>
+      </w:r>
+      <w:r>
+        <w:t xml:space="preserve"> </w:t>
+      </w:r>
+      <w:r>
+        <w:rPr>
+          <w:rStyle w:val="VerbatimChar"/>
+        </w:rPr>
+        <w:t xml:space="preserve">Ctrl+P</w:t>
+      </w:r>
+      <w:r>
+        <w:t xml:space="preserve"> </w:t>
+      </w:r>
+      <w:r>
+        <w:t xml:space="preserve">/</w:t>
+      </w:r>
+      <w:r>
+        <w:t xml:space="preserve"> </w:t>
+      </w:r>
+      <w:r>
+        <w:rPr>
+          <w:rStyle w:val="VerbatimChar"/>
+        </w:rPr>
+        <w:t xml:space="preserve">Cmd+,</w:t>
+      </w:r>
+      <w:r>
+        <w:t xml:space="preserve">).</w:t>
+      </w:r>
+    </w:p>
+    <w:p>
+      <w:pPr>
+        <w:pStyle w:val="Compact"/>
+        <w:numPr>
+          <w:ilvl w:val="1"/>
+          <w:numId w:val="1013"/>
+        </w:numPr>
+      </w:pPr>
+      <w:r>
+        <w:t xml:space="preserve">Select the</w:t>
+      </w:r>
+      <w:r>
+        <w:t xml:space="preserve"> </w:t>
+      </w:r>
+      <w:r>
+        <w:rPr>
+          <w:b/>
+          <w:bCs/>
+        </w:rPr>
+        <w:t xml:space="preserve">Place</w:t>
+      </w:r>
+      <w:r>
+        <w:t xml:space="preserve"> </w:t>
+      </w:r>
+      <w:r>
+        <w:t xml:space="preserve">tab.</w:t>
+      </w:r>
+    </w:p>
+    <w:p>
+      <w:pPr>
+        <w:pStyle w:val="Compact"/>
+        <w:numPr>
+          <w:ilvl w:val="1"/>
+          <w:numId w:val="1013"/>
+        </w:numPr>
+      </w:pPr>
+      <w:r>
+        <w:t xml:space="preserve">Select your City, State, and Country (built-in coordinates exist for major worldwide and Indian cities, or enter custom Latitude/Longitude and TimeZone).</w:t>
+      </w:r>
+    </w:p>
+    <w:p>
+      <w:pPr>
+        <w:pStyle w:val="Compact"/>
+        <w:numPr>
+          <w:ilvl w:val="1"/>
+          <w:numId w:val="1013"/>
+        </w:numPr>
+      </w:pPr>
+      <w:r>
+        <w:t xml:space="preserve">Click</w:t>
+      </w:r>
+      <w:r>
+        <w:t xml:space="preserve"> </w:t>
+      </w:r>
+      <w:r>
+        <w:rPr>
+          <w:b/>
+          <w:bCs/>
+        </w:rPr>
+        <w:t xml:space="preserve">Save</w:t>
+      </w:r>
+      <w:r>
+        <w:t xml:space="preserve"> </w:t>
+      </w:r>
+      <w:r>
+        <w:t xml:space="preserve">/</w:t>
+      </w:r>
+      <w:r>
+        <w:t xml:space="preserve"> </w:t>
+      </w:r>
+      <w:r>
+        <w:rPr>
+          <w:b/>
+          <w:bCs/>
+        </w:rPr>
+        <w:t xml:space="preserve">OK</w:t>
+      </w:r>
+      <w:r>
+        <w:t xml:space="preserve">.</w:t>
+      </w:r>
+    </w:p>
+    <w:p>
+      <w:pPr>
+        <w:pStyle w:val="Compact"/>
+        <w:numPr>
+          <w:ilvl w:val="0"/>
+          <w:numId w:val="1012"/>
+        </w:numPr>
+      </w:pPr>
+      <w:r>
+        <w:rPr>
+          <w:b/>
+          <w:bCs/>
+        </w:rPr>
+        <w:t xml:space="preserve">Setting Ayanamsa</w:t>
+      </w:r>
+      <w:r>
+        <w:t xml:space="preserve">:</w:t>
+      </w:r>
+    </w:p>
+    <w:p>
+      <w:pPr>
+        <w:pStyle w:val="Compact"/>
+        <w:numPr>
+          <w:ilvl w:val="1"/>
+          <w:numId w:val="1014"/>
+        </w:numPr>
+      </w:pPr>
+      <w:r>
+        <w:t xml:space="preserve">Astrosoft defaults to</w:t>
+      </w:r>
+      <w:r>
+        <w:t xml:space="preserve"> </w:t>
+      </w:r>
+      <w:r>
+        <w:rPr>
+          <w:b/>
+          <w:bCs/>
+        </w:rPr>
+        <w:t xml:space="preserve">Lahiri</w:t>
+      </w:r>
+      <w:r>
+        <w:t xml:space="preserve"> </w:t>
+      </w:r>
+      <w:r>
+        <w:t xml:space="preserve">ayanamsa (Chitrapaksha), with Raman and KP ayanamsas available under Preferences.</w:t>
+      </w:r>
+    </w:p>
+    <w:p>
+      <w:pPr>
+        <w:pStyle w:val="Compact"/>
+        <w:numPr>
+          <w:ilvl w:val="0"/>
+          <w:numId w:val="1012"/>
+        </w:numPr>
+      </w:pPr>
+      <w:r>
+        <w:rPr>
+          <w:b/>
+          <w:bCs/>
+        </w:rPr>
+        <w:t xml:space="preserve">Opening Muhurta</w:t>
+      </w:r>
+      <w:r>
+        <w:t xml:space="preserve">:</w:t>
+      </w:r>
+    </w:p>
+    <w:p>
+      <w:pPr>
+        <w:pStyle w:val="Compact"/>
+        <w:numPr>
+          <w:ilvl w:val="1"/>
+          <w:numId w:val="1015"/>
         </w:numPr>
       </w:pPr>
       <w:r>
@@ -1589,8 +2184,8 @@
         </w:pict>
       </w:r>
     </w:p>
-    <w:bookmarkEnd w:id="19"/>
-    <w:bookmarkStart w:id="20" w:name="troubleshooting"/>
+    <w:bookmarkEnd w:id="21"/>
+    <w:bookmarkStart w:id="22" w:name="troubleshooting"/>
     <w:p>
       <w:pPr>
         <w:pStyle w:val="Heading2"/>
@@ -1748,7 +2343,7 @@
               <w:rPr>
                 <w:rStyle w:val="VerbatimChar"/>
               </w:rPr>
-              <w:t xml:space="preserve">./RunAstroSoft.sh</w:t>
+              <w:t xml:space="preserve">./RunAstroSoft20.sh</w:t>
             </w:r>
             <w:r>
               <w:t xml:space="preserve"> </w:t>
@@ -1787,7 +2382,7 @@
               <w:rPr>
                 <w:rStyle w:val="VerbatimChar"/>
               </w:rPr>
-              <w:t xml:space="preserve">chmod +x RunAstroSoft.sh bin/RunAstroSoft.sh</w:t>
+              <w:t xml:space="preserve">chmod +x RunAstroSoft20.sh bin/RunAstroSoft20.sh</w:t>
             </w:r>
             <w:r>
               <w:t xml:space="preserve"> </w:t>
@@ -1849,7 +2444,7 @@
               <w:rPr>
                 <w:rStyle w:val="VerbatimChar"/>
               </w:rPr>
-              <w:t xml:space="preserve">RunAstroSoft.bat</w:t>
+              <w:t xml:space="preserve">RunAstroSoft20.bat</w:t>
             </w:r>
             <w:r>
               <w:t xml:space="preserve"> </w:t>
@@ -1864,7 +2459,7 @@
               <w:rPr>
                 <w:rStyle w:val="VerbatimChar"/>
               </w:rPr>
-              <w:t xml:space="preserve">RunAstroSoft.sh</w:t>
+              <w:t xml:space="preserve">RunAstroSoft20.sh</w:t>
             </w:r>
             <w:r>
               <w:t xml:space="preserve"> </w:t>
@@ -1952,8 +2547,8 @@
         </w:pict>
       </w:r>
     </w:p>
-    <w:bookmarkEnd w:id="20"/>
-    <w:bookmarkStart w:id="21" w:name="reporting-feedback-issues"/>
+    <w:bookmarkEnd w:id="22"/>
+    <w:bookmarkStart w:id="23" w:name="reporting-feedback-issues"/>
     <w:p>
       <w:pPr>
         <w:pStyle w:val="Heading2"/>
@@ -1994,8 +2589,8 @@
         <w:t xml:space="preserve">* Screenshots of any visual or layout defects.</w:t>
       </w:r>
     </w:p>
-    <w:bookmarkEnd w:id="21"/>
-    <w:bookmarkEnd w:id="22"/>
+    <w:bookmarkEnd w:id="23"/>
+    <w:bookmarkEnd w:id="24"/>
     <w:sectPr>
       <w:footnotePr>
         <w:numRestart w:val="eachSect"/>
@@ -2433,6 +3028,9 @@
     </w:lvlOverride>
   </w:num>
   <w:num w:numId="1010">
+    <w:abstractNumId w:val="991"/>
+  </w:num>
+  <w:num w:numId="1011">
     <w:abstractNumId w:val="99411"/>
     <w:lvlOverride w:ilvl="0">
       <w:startOverride w:val="1"/>
@@ -2462,13 +3060,43 @@
       <w:startOverride w:val="1"/>
     </w:lvlOverride>
   </w:num>
-  <w:num w:numId="1011">
+  <w:num w:numId="1012">
+    <w:abstractNumId w:val="99411"/>
+    <w:lvlOverride w:ilvl="0">
+      <w:startOverride w:val="1"/>
+    </w:lvlOverride>
+    <w:lvlOverride w:ilvl="1">
+      <w:startOverride w:val="1"/>
+    </w:lvlOverride>
+    <w:lvlOverride w:ilvl="2">
+      <w:startOverride w:val="1"/>
+    </w:lvlOverride>
+    <w:lvlOverride w:ilvl="3">
+      <w:startOverride w:val="1"/>
+    </w:lvlOverride>
+    <w:lvlOverride w:ilvl="4">
+      <w:startOverride w:val="1"/>
+    </w:lvlOverride>
+    <w:lvlOverride w:ilvl="5">
+      <w:startOverride w:val="1"/>
+    </w:lvlOverride>
+    <w:lvlOverride w:ilvl="6">
+      <w:startOverride w:val="1"/>
+    </w:lvlOverride>
+    <w:lvlOverride w:ilvl="7">
+      <w:startOverride w:val="1"/>
+    </w:lvlOverride>
+    <w:lvlOverride w:ilvl="8">
+      <w:startOverride w:val="1"/>
+    </w:lvlOverride>
+  </w:num>
+  <w:num w:numId="1013">
     <w:abstractNumId w:val="991"/>
   </w:num>
-  <w:num w:numId="1012">
+  <w:num w:numId="1014">
     <w:abstractNumId w:val="991"/>
   </w:num>
-  <w:num w:numId="1013">
+  <w:num w:numId="1015">
     <w:abstractNumId w:val="991"/>
   </w:num>
 </w:numbering>

</xml_diff>